<commit_message>
court(oklacrimapp): answering brief gated on master's model (fb-595.54.61)
Engines regenerated; the URL, sign and heading-keep rules of fb-595.54.82 close the pass-1 blockers. latex and docx
break every line where typst does; tier 1 0 failed on every engine.

Co-Authored-By: Claude Opus 5.5 <noreply@anthropic.com>
</commit_message>
<xml_diff>
--- a/courts/tenth-circuit/oklahoma/state/court-of-criminal-appeals/answering-brief/usage/OUTPUT-answering-brief.docx
+++ b/courts/tenth-circuit/oklahoma/state/court-of-criminal-appeals/answering-brief/usage/OUTPUT-answering-brief.docx
@@ -1302,13 +1302,7 @@
         <w:pStyle w:val="BodyText"/>
       </w:pPr>
       <w:r>
-        <w:t xml:space="preserve">On July 9, 2020, the United States Supreme Court in McGirt v. Oklahoma, 140 S. Ct. 2452 (2020), held that, for purposes of the Major Crimes Act (18 U.S.C. § 1153), the Creek Nation’s Reservation has not been disestablished. The Court also affirmed the Tenth Circuit’s decision in Murphy v. Royal, 875 F.3d 896 (10th Cir. 2017), for the reasons stated in McGirt. Sharp v. Murphy, 140 S. Ct. 2412 (2020). On July 16, 2020, this Court granted the State’s request to file a response to Petitioner’s claim, in Proposition I of this successive post-conviction application, that the State lacked jurisdiction in his case pursuant to 18 U.S.C. §§ 1151</w:t>
-      </w:r>
-      <w:r>
-        <w:noBreakHyphen/>
-      </w:r>
-      <w:r>
-        <w:t xml:space="preserve">1153. Successive Application for Post-Conviction Relief – Death Penalty (hereinafter, “App.”) at 15</w:t>
+        <w:t xml:space="preserve">On July 9, 2020, the United States Supreme Court in McGirt v. Oklahoma, 140 S. Ct. 2452 (2020), held that, for purposes of the Major Crimes Act (18 U.S.C. § 1153), the Creek Nation’s Reservation has not been disestablished. The Court also affirmed the Tenth Circuit’s decision in Murphy v. Royal, 875 F.3d 896 (10th Cir. 2017), for the reasons stated in McGirt. Sharp v. Murphy, 140 S. Ct. 2412 (2020). On July 16, 2020, this Court granted the State’s request to file a response to Petitioner’s claim, in Proposition I of this successive post-conviction application, that the State lacked jurisdiction in his case pursuant to 18 U.S.C. §§ 1151-⁠1153. Successive Application for Post-Conviction Relief – Death Penalty (hereinafter, “App.”) at 15</w:t>
       </w:r>
       <w:r>
         <w:noBreakHyphen/>
@@ -1420,13 +1414,7 @@
         <w:noBreakHyphen/>
       </w:r>
       <w:r>
-        <w:t xml:space="preserve">3 (2016). On remand, this Court again affirmed the judgment and sentence on May 25, 2017, finding the victim impact testimony in question was harmless beyond a reasonable doubt. Bosse v. State, 2017 OK CR 10, ¶¶ 56</w:t>
-      </w:r>
-      <w:r>
-        <w:noBreakHyphen/>
-      </w:r>
-      <w:r>
-        <w:t xml:space="preserve">63, 400 P.3d 834, 855</w:t>
+        <w:t xml:space="preserve">3 (2016). On remand, this Court again affirmed the judgment and sentence on May 25, 2017, finding the victim impact testimony in question was harmless beyond a reasonable doubt. Bosse v. State, 2017 OK CR 10, ¶¶ 56-⁠63, 400 P.3d 834, 855</w:t>
       </w:r>
       <w:r>
         <w:noBreakHyphen/>
@@ -1532,21 +1520,15 @@
         <w:pStyle w:val="BodyText"/>
       </w:pPr>
       <w:r>
-        <w:t xml:space="preserve">In order to satisfy the second requirement, the defendant or victim must be affiliated with a Tribe that is recognized by the federal government.3 The Supreme Court has never ruled whether any evidence beyond enrollment, citizenship, or membership with a federally-recognized tribe can show this second element of Indian status for purposes of federal criminal law. See Antelope, 430 U.S. at 647 n.7 (“Since respondents are enrolled tribal members, we are not called on to decide whether nonenrolled Indians are subject to 18 U.S.C. § 1153, and we therefore intimate no views on the matter.”). Other courts are in substantial conflict about the appropriate test, meaning that “case outcomes have not formed a consistent pattern,” which has caused “commentators [to] criticize[] these inconsistencies, and urge[] adoption of a single, clearly articulated definition.” The State demonstrates in Part III, infra, that the defendant bears the burden to prove Indian status when raising a jurisdictional claim under the Major Crimes Act. See United States v. Antelope, 430 U.S. 641, 646 n.7 (1977) (“members of tribes whose official status has been terminated by congressional enactment are no longer subject, by virtue of their status, to federal criminal jurisdiction under the Major Crimes Act”); State v. Daniels, 16 P.3d 650, 654 (Wash. Ct. App. 2001); see also State v. Sebastian, 701 A.2d 13, 24 n. 28 (Conn. 1997) (“most recent federal cases consider whether the tribe to which a defendant or victim claims membership or affiliation has been acknowledged by the federal government”). Cohen’s Handbook of Federal Indian Law, § 3.03[4]. In our view, proper respect for tribal sovereignty, constitutional considerations, and judicial economy all should mean that only those with Indian blood who are enrolled with a federally-recognized Indian tribe should be subject to the provisions of 18 U.S.C. §§ 1152</w:t>
-      </w:r>
-      <w:r>
-        <w:noBreakHyphen/>
-      </w:r>
-      <w:r>
-        <w:t xml:space="preserve">53. This is so for three reasons.</w:t>
-      </w:r>
-    </w:p>
-    <w:p>
-      <w:pPr>
-        <w:pStyle w:val="BodyText"/>
-      </w:pPr>
-      <w:r>
-        <w:t xml:space="preserve">First, proper respect for tribal sovereignty means according deference to the Tribe’s determination of who is—and who is not—a citizen of their sovereign. Plains Commerce Bank v. Long Family Land &amp; Cattle Co., 554 U.S. 316, 327 (2008) (“tribes retain power . . . to determine tribal membership”). “A tribe’s right to define its own membership for tribal purposes has long been recognized as central to its existence as an independent political community,” so “the judiciary should not rush to … intrude on these delicate matters.” Santa Clara Pueblo v. Martinez, 436 U.S. 49, 72 &amp; n. 32 (1978).4 And because in modern times tribes consistently “keep formal, written rolls,” there is no need to resort to older “generalized” tests that focus on uncertain criteria like “retaining tribal relations.” Cohen’s, supra, at § 3.03[2]. In the end, “determining whether a specific individual racially belongs to a certain group is not within the province of the courts’ expertise and should be left to the Indians or specific tribe. The tribe knows best whether an individual has Indian blood or has been living an Indian-lifestyle. . . . [L]eaving the decision to each particular tribe would allow them to exercise their sovereignty.” 5</w:t>
+        <w:t xml:space="preserve">In order to satisfy the second requirement, the defendant or victim must be affiliated with a Tribe that is recognized by the federal government.3 The Supreme Court has never ruled whether any evidence beyond enrollment, citizenship, or membership with a federally-recognized tribe can show this second element of Indian status for purposes of federal criminal law. See Antelope, 430 U.S. at 647 n.7 (“Since respondents are enrolled tribal members, we are not called on to decide whether nonenrolled Indians are subject to 18 U.S.C. § 1153, and we therefore intimate no views on the matter.”). Other courts are in substantial conflict about the appropriate test, meaning that “case outcomes have not formed a consistent pattern,” which has caused “commentators [to] criticize[] these inconsistencies, and urge[] adoption of a single, clearly articulated definition.” The State demonstrates in Part III, infra, that the defendant bears the burden to prove Indian status when raising a jurisdictional claim under the Major Crimes Act. See United States v. Antelope, 430 U.S. 641, 646 n.7 (1977) (“members of tribes whose official status has been terminated by congressional enactment are no longer subject, by virtue of their status, to federal criminal jurisdiction under the Major Crimes Act”); State v. Daniels, 16 P.3d 650, 654 (Wash. Ct. App. 2001); see also State v. Sebastian, 701 A.2d 13, 24 n. 28 (Conn. 1997) (“most recent federal cases consider whether the tribe to which a defendant or victim claims membership or affiliation has been acknowledged by the federal government”). Cohen’s Handbook of Federal Indian Law, § 3.03[4]. In our view, proper respect for tribal sovereignty, constitutional considerations, and judicial economy all should mean that only those with Indian blood who are enrolled with a federally-recognized Indian tribe should be subject to the provisions of 18 U.S.C. §§ 1152-⁠53. This is so for three reasons.</w:t>
+      </w:r>
+    </w:p>
+    <w:p>
+      <w:pPr>
+        <w:pStyle w:val="BodyText"/>
+      </w:pPr>
+      <w:r>
+        <w:t xml:space="preserve">First, proper respect for tribal sovereignty means according deference to the Tribe’s determination of who is—and who is not—a citizen of their sovereign. Plains Commerce Bank v. Long Family Land &amp; Cattle Co., 554 U.S. 316, 327 (2008) (“tribes retain power . . . to determine tribal membership”). “A tribe’s right to define its own membership for tribal purposes has long been recognized as central to its existence as an independent political community,” so “the judiciary should not rush to … intrude on these delicate matters.” Santa Clara Pueblo v. Martinez, 436 U.S. 49, 72 &amp; n. 32 (1978).4 And because in modern times tribes consistently “keep formal, written rolls,” there is no need to resort to older “generalized” tests that focus on uncertain criteria like “retaining tribal relations.” Cohen’s, supra, at § 3.03[2]. In the end, “determining whether a specific individual racially belongs to a certain group is not within the province of the courts’ expertise and should be left to the Indians or specific tribe. The tribe knows best whether an individual has Indian blood or has been living an Indian-lifestyle. . . . [L]eaving the decision to each particular tribe would allow them to exercise their sovereignty.” 5</w:t>
       </w:r>
     </w:p>
     <w:p>
@@ -1596,7 +1578,7 @@
         <w:pStyle w:val="BodyText"/>
       </w:pPr>
       <w:r>
-        <w:t xml:space="preserve">live an Indian lifestyle? . . . Tribes have already established clear, definite</w:t>
+        <w:t xml:space="preserve">live an Indian lifestyle? . . . Tribes have already established clear, definite</w:t>
       </w:r>
     </w:p>
     <w:p>
@@ -1682,13 +1664,7 @@
         <w:pStyle w:val="BodyText"/>
       </w:pPr>
       <w:r>
-        <w:t xml:space="preserve">For example, focusing on federal assistance outside the Major Crimes Act is problematic because “[w]ho counts as an Indian for purposes of federal Indian law varies according to the legal context. There is no universally applicable definition.” Cohen’s, supra, at § 3.03[1]; see also id. at § 3.03[4]. We cannot simply assume that when Congress classifies a person as an Indian for one purpose, it necessarily classifies that person as an Indian for other purposes, such as the criminal provisions of 18 U.S.C. §§ 1152</w:t>
-      </w:r>
-      <w:r>
-        <w:noBreakHyphen/>
-      </w:r>
-      <w:r>
-        <w:t xml:space="preserve">53. For example, “a member of a terminated tribe will be considered an Indian for the purposes of federal programs that are available to all Indians, asking predominately non-tribal jurors to weigh any number of factors to determine whether the defendant is Indian.”) In light of the vastness of the claimed reservations of the Five Tribes, and the fact that they have not been recognized as such for over 100 years, “living on a reservation” should carry no weight. including members of terminated tribes,” but members of terminated tribes are not considered Indians for purposes of federal criminal law. Id. (citing Antelope, 430 U.S. at 646</w:t>
+        <w:t xml:space="preserve">For example, focusing on federal assistance outside the Major Crimes Act is problematic because “[w]ho counts as an Indian for purposes of federal Indian law varies according to the legal context. There is no universally applicable definition.” Cohen’s, supra, at § 3.03[1]; see also id. at § 3.03[4]. We cannot simply assume that when Congress classifies a person as an Indian for one purpose, it necessarily classifies that person as an Indian for other purposes, such as the criminal provisions of 18 U.S.C. §§ 1152-⁠53. For example, “a member of a terminated tribe will be considered an Indian for the purposes of federal programs that are available to all Indians, asking predominately non-tribal jurors to weigh any number of factors to determine whether the defendant is Indian.”) In light of the vastness of the claimed reservations of the Five Tribes, and the fact that they have not been recognized as such for over 100 years, “living on a reservation” should carry no weight. including members of terminated tribes,” but members of terminated tribes are not considered Indians for purposes of federal criminal law. Id. (citing Antelope, 430 U.S. at 646</w:t>
       </w:r>
       <w:r>
         <w:noBreakHyphen/>
@@ -1830,7 +1806,7 @@
         <w:pStyle w:val="BodyText"/>
       </w:pPr>
       <w:r>
-        <w:t xml:space="preserve">While “[f]ederal criminal jurisdiction is limited by federalism concerns; states retain primary criminal jurisdiction in our system.” United States v. Prentiss, 206 F.3d 960, 967 (10th Cir. 2000). Thus, the general rule in state prosecutions—including in Oklahoma—is that a state is presumed to have jurisdiction over all crimes committed within its borders. See Okla. Const. Art. VII, § 7 (“The District Court[s of Oklahoma] shall have unlimited original jurisdiction of all justiciable matters . . . .”); State v. L.J.M., 918 P.2d 898, 902 (Wash. 1996) (en banc); State v. Verdugo, 901 P.2d 1165, 1167 (Ariz. Ct. App. 1995); State v. St. Francis, 563 A.2d 249, 252 (Vt. 1989); cf. Oregon v. Hill, 373 P.3d 162, 173 (Or. Ct. App. 2016) (Indian country jurisdiction is an “exception” to state jurisdiction).</w:t>
+        <w:t xml:space="preserve">While “[f]ederal criminal jurisdiction is limited by federalism concerns; states retain primary criminal jurisdiction in our system.” United States v. Prentiss, 206 F.3d 960, 967 (10th Cir. 2000). Thus, the general rule in state prosecutions—including in Oklahoma—is that a state is presumed to have jurisdiction over all crimes committed within its borders. See Okla. Const. Art. VII, § 7 (“The District Court[s of Oklahoma] shall have unlimited original jurisdiction of all justiciable matters . . . .”); State v. L.J.M., 918 P.2d 898, 902 (Wash. 1996) (en banc); State v. Verdugo, 901 P.2d 1165, 1167 (Ariz. Ct. App. 1995); State v. St. Francis, 563 A.2d 249, 252 (Vt. 1989); cf. Oregon v. Hill, 373 P.3d 162, 173 (Or. Ct. App. 2016) (Indian country jurisdiction is an “exception” to state jurisdiction).</w:t>
       </w:r>
     </w:p>
     <w:p>
@@ -1878,7 +1854,7 @@
         <w:noBreakHyphen/>
       </w:r>
       <w:r>
-        <w:t xml:space="preserve">647, slip op. at 2 (Okla. Crim. App. May 7, 2020) (holding, in case alleging Indian country jurisdiction, that “Petitioner has failed to establish entitlement to any relief in this post-conviction proceeding.”) (unpublished and attached as Exhibit A); Russell v. Cherokee Cty. Dist. Court, 1968 OK CR 45, ¶ 5, 438 P.2d 293, 294 (“It is fundamental that where a . . . . post conviction appeal[] is filed, the burden is upon the petitioner to sustain the allegations of his petition, and that every presumption favors the regularity of the proceedings had in the trial court.”); see also Lewis v. State, 55 P.3d 875, 877 (Idaho Ct. App. 2002) (“As an applicant for post-conviction relief, Lewis therefore had the burden of proving, by a preponderance of the evidence, the allegations [of Indian country jurisdiction] on which his application was based.”); Primeaux v. Leapley, 502 N.W.2d 265, 270 (S.D. 1993) (holding state habeas petitioner failed to satisfy his burden of proving Indian country jurisdiction); Verdugo, 901 P.2d at 1169 (placing burden of proof on post-conviction petitioner); cf. Eaves v. Champion, 113 F.3d 1246, *1 (10th Cir. June 2, 1997) (unpublished) (holding, in an Indian country case arising out of Oklahoma, that “[w]here a state conviction is collaterally attacked in a habeas corpus proceeding under § 2254, the burden of proof is on the petitioner.”).</w:t>
+        <w:t xml:space="preserve">647, slip op. at 2 (Okla. Crim. App. May 7, 2020) (holding, in case alleging Indian country jurisdiction, that “Petitioner has failed to establish entitlement to any relief in this post-conviction proceeding.”) (unpublished and attached as Exhibit A); Russell v. Cherokee Cty. Dist. Court, 1968 OK CR 45, ¶ 5, 438 P.2d 293, 294 (“It is fundamental that where a . . . . post conviction appeal[] is filed, the burden is upon the petitioner to sustain the allegations of his petition, and that every presumption favors the regularity of the proceedings had in the trial court.”); see also Lewis v. State, 55 P.3d 875, 877 (Idaho Ct. App. 2002) (“As an applicant for post-conviction relief, Lewis therefore had the burden of proving, by a preponderance of the evidence, the allegations [of Indian country jurisdiction] on which his application was based.”); Primeaux v. Leapley, 502 N.W.2d 265, 270 (S.D. 1993) (holding state habeas petitioner failed to satisfy his burden of proving Indian country jurisdiction); Verdugo, 901 P.2d at 1169 (placing burden of proof on post-conviction petitioner); cf. Eaves v. Champion, 113 F.3d 1246, *1 (10th Cir. June 2, 1997) (unpublished) (holding, in an Indian country case arising out of Oklahoma, that “[w]here a state conviction is collaterally attacked in a habeas corpus proceeding under § 2254, the burden of proof is on the petitioner.”).</w:t>
       </w:r>
     </w:p>
     <w:p>
@@ -2164,7 +2140,7 @@
         <w:noBreakHyphen/>
       </w:r>
       <w:r>
-        <w:t xml:space="preserve">26. Again, such dicta cannot substitute for the lack of clear statutory text. Indeed, the Supreme Court had earlier stated that by admission into the Union, a state on equal footing with other states “has acquired criminal jurisdiction over its own citizens and other white persons throughout the whole of the territory within its limits, . . . and that [a] reservation is no longer within the sole and exclusive jurisdiction of the United States,” unless Congress expressly provides otherwise. United States v. McBratney, 104 U.S. 621, 623</w:t>
+        <w:t xml:space="preserve">26. Again, such dicta cannot substitute for the lack of clear statutory text. Indeed, the Supreme Court had earlier stated that by admission into the Union, a state on equal footing with other states “has acquired criminal jurisdiction over its own citizens and other white persons throughout the whole of the territory within its limits, . . . and that [a] reservation is no longer within the sole and exclusive jurisdiction of the United States,” unless Congress expressly provides otherwise. United States v. McBratney, 104 U.S. 621, 623</w:t>
       </w:r>
       <w:r>
         <w:noBreakHyphen/>
@@ -2302,7 +2278,7 @@
         <w:noBreakHyphen/>
       </w:r>
       <w:r>
-        <w:t xml:space="preserve">28, which allows “any State not having jurisdiction over criminal offenses committed by or against Indians in the areas of Indian country situated within such State to assume” such jurisdiction “with the consent of the Indian tribe,” 25 U.S.C. § 1321—with courts implying that the states otherwise lack that jurisdiction over crimes committed “against Indians.” But Public Law 280 has nearly the same language with respect to civil jurisdiction, allowing “any State not having jurisdiction over civil causes of action between Indians or to which Indians are parties which arise in the areas of Indian country situated within such State to assume, with the consent of the tribe,” such civil jurisdiction. 25 U.S.C. § 1322. And yet, as noted above, this language has not precluded the U.S. Supreme Court from ruling that, even without Public Law 280, states generally have jurisdiction over civil actions with Indians as parties, that is, as plaintiffs. See Three Affiliated Tribes, 467 U.S. at 148</w:t>
+        <w:t xml:space="preserve">28, which allows “any State not having jurisdiction over criminal offenses committed by or against Indians in the areas of Indian country situated within such State to assume” such jurisdiction “with the consent of the Indian tribe,” 25 U.S.C. § 1321—⁠with courts implying that the states otherwise lack that jurisdiction over crimes committed “against Indians.” But Public Law 280 has nearly the same language with respect to civil jurisdiction, allowing “any State not having jurisdiction over civil causes of action between Indians or to which Indians are parties which arise in the areas of Indian country situated within such State to assume, with the consent of the tribe,” such civil jurisdiction. 25 U.S.C. § 1322. And yet, as noted above, this language has not precluded the U.S. Supreme Court from ruling that, even without Public Law 280, states generally have jurisdiction over civil actions with Indians as parties, that is, as plaintiffs. See Three Affiliated Tribes, 467 U.S. at 148</w:t>
       </w:r>
       <w:r>
         <w:noBreakHyphen/>
@@ -2316,7 +2292,7 @@
         <w:pStyle w:val="BodyText"/>
       </w:pPr>
       <w:r>
-        <w:t xml:space="preserve">Ultimately, state jurisdiction here furthers both federal and tribal interests by providing additional assurance that tribal members who are victims of crime will receive justice, either from the federal government, state government, or both. Cf. Three Affiliated Tribes, 476 U.S. at 888 (1986) (“tribal autonomy and self-government are not impeded when a State allows an Indian to enter its court to seek relief against a non-Indian concerning a claim arising in Indian country”). It minimizes the chances abusers and murderers of Indians will escape punishment and maximizes the protection from violence received by Native Americans. This is especially important because, as commentators have expressed in fear after McGirt, federal authorities frequently decline to prosecute crimes on their reservations.13 While McGirt leaves Indians vulnerable under the exclusive federal jurisdiction of the Major Crimes Act, there is no reason to perpetuate that injustice by assuming without textual support exclusive federal jurisdiction over non-Indian on Indian crimes covered by the General Crimes Act. Nor is there reason to believe the State of Oklahoma will not vigorously defend the rights of Indian victims, as it has for a century. See Oklahoma Tax Comm’n v. United States, 319 U.S. 598, 608–09 (1943) (“Oklahoma supplies [Indians] and their children schools, roads, courts, police protection and all the other benefits of an ordered society.”). In fact, this very case proves it will. To hold otherwise would amount to “disenfranchising” and “closing our Courts to a large number of citizens of Indian heritage who See, e.g., David Heska Wanbli Weiden, This 19th-Century Law Helps Shape Criminal Justice in Indian Country And that’s a problem — especially for Native American women, and especially in rape cases, N.Y. TIMES (July 19, 2020), https://www.nytimes.com/2020/07/19/​opinion/​mcgirt-native-reservation- implications.html. live on a reservation,” thereby “denying protection from the criminal element of the state.” Greenwalt, 663 P.2d at 208</w:t>
+        <w:t xml:space="preserve">Ultimately, state jurisdiction here furthers both federal and tribal interests by providing additional assurance that tribal members who are victims of crime will receive justice, either from the federal government, state government, or both. Cf. Three Affiliated Tribes, 476 U.S. at 888 (1986) (“tribal autonomy and self-government are not impeded when a State allows an Indian to enter its court to seek relief against a non-Indian concerning a claim arising in Indian country”). It minimizes the chances abusers and murderers of Indians will escape punishment and maximizes the protection from violence received by Native Americans. This is especially important because, as commentators have expressed in fear after McGirt, federal authorities frequently decline to prosecute crimes on their reservations.13 While McGirt leaves Indians vulnerable under the exclusive federal jurisdiction of the Major Crimes Act, there is no reason to perpetuate that injustice by assuming without textual support exclusive federal jurisdiction over non-Indian on Indian crimes covered by the General Crimes Act. Nor is there reason to believe the State of Oklahoma will not vigorously defend the rights of Indian victims, as it has for a century. See Oklahoma Tax Comm’n v. United States, 319 U.S. 598, 608–09 (1943) (“Oklahoma supplies [Indians] and their children schools, roads, courts, police protection and all the other benefits of an ordered society.”). In fact, this very case proves it will. To hold otherwise would amount to “disenfranchising” and “closing our Courts to a large number of citizens of Indian heritage who See, e.g., David Heska Wanbli Weiden, This 19th-Century Law Helps Shape Criminal Justice in Indian Country And that’s a problem — especially for Native American women, and especially in rape cases, N.Y. TIMES (July 19, 2020), https://​www.​nytimes.​com/​2020/​07/​19/​opinion/​mcgirt-​native-​reservation- implications.html. live on a reservation,” thereby “denying protection from the criminal element of the state.” Greenwalt, 663 P.2d at 208</w:t>
       </w:r>
       <w:r>
         <w:noBreakHyphen/>
@@ -2468,7 +2444,7 @@
         <w:pStyle w:val="BodyText"/>
       </w:pPr>
       <w:r>
-        <w:t xml:space="preserve">State, 2013 OKCR 2, ¶ 1, 293 P.3d 969, 973. . . . McGirt, slip op. at 38. This Court should accept that invitation.</w:t>
+        <w:t xml:space="preserve">State, 2013 OKCR 2, ¶ 1, 293 P.3d 969, 973. . . . McGirt, slip op. at 38. This Court should accept that invitation.</w:t>
       </w:r>
     </w:p>
     <w:p>
@@ -2802,13 +2778,7 @@
         <w:pStyle w:val="BodyText"/>
       </w:pPr>
       <w:r>
-        <w:t xml:space="preserve">Under § 1089(D)⁠(9)⁠(b), Petitioner’s jurisdictional claim does not implicate any new, retroactive rule of constitutional law announced by the Supreme Court or this Court. “[A] case announces a ‘new’ rule when it ‘breaks new ground or imposes a new obligation’ or if its result ‘was not dictated by precedent existing at the time the defendant’s conviction became final.’” Walker, 1997 OK CR 3, ¶ 38, 933 P.2d at 338 (quoting Teague, 489 U.S. at 301) (alteration adopted, emphasis supplied by Teague). A case does “not announce a new rule” when it is “merely an application of the principle that governed [an earlier] decision.” Teague, 489 U.S. at 307. As already shown above, McGirt was a mere application of, and was dictated by, Solem.18 Further, the decision did not break new ground or impose a new obligation on the State— even prior to this decision, under the relevant federal statutes, the State did not have jurisdiction to prosecute an Indian who committed a major crime in Indian Country. McGirt simply held that the original Creek Reservation was still Indian Country for purposes of these statutes. For all these reasons, McGirt did not announce a new rule, let alone a retroactive one. See Walker, 1997 OK CR 3, And the Tenth Circuit’s decision in Murphy was not a decision of the Supreme Court or this Court. To the extent that Petitioner relies on the Supreme Court’s Murphy decision, such simply affirmed the Tenth Circuit’s decision for the reasons stated in McGirt. Murphy, slip op. at 1. Thus, the Supreme Court’s Murphy decision no more announced a new rule than did McGirt. ¶¶ 34</w:t>
-      </w:r>
-      <w:r>
-        <w:noBreakHyphen/>
-      </w:r>
-      <w:r>
-        <w:t xml:space="preserve">38, 933 P.2d at 338</w:t>
+        <w:t xml:space="preserve">Under § 1089(D)⁠(9)⁠(b), Petitioner’s jurisdictional claim does not implicate any new, retroactive rule of constitutional law announced by the Supreme Court or this Court. “[A] case announces a ‘new’ rule when it ‘breaks new ground or imposes a new obligation’ or if its result ‘was not dictated by precedent existing at the time the defendant’s conviction became final.’” Walker, 1997 OK CR 3, ¶ 38, 933 P.2d at 338 (quoting Teague, 489 U.S. at 301) (alteration adopted, emphasis supplied by Teague). A case does “not announce a new rule” when it is “merely an application of the principle that governed [an earlier] decision.” Teague, 489 U.S. at 307. As already shown above, McGirt was a mere application of, and was dictated by, Solem.18 Further, the decision did not break new ground or impose a new obligation on the State— even prior to this decision, under the relevant federal statutes, the State did not have jurisdiction to prosecute an Indian who committed a major crime in Indian Country. McGirt simply held that the original Creek Reservation was still Indian Country for purposes of these statutes. For all these reasons, McGirt did not announce a new rule, let alone a retroactive one. See Walker, 1997 OK CR 3, And the Tenth Circuit’s decision in Murphy was not a decision of the Supreme Court or this Court. To the extent that Petitioner relies on the Supreme Court’s Murphy decision, such simply affirmed the Tenth Circuit’s decision for the reasons stated in McGirt. Murphy, slip op. at 1. Thus, the Supreme Court’s Murphy decision no more announced a new rule than did McGirt. ¶¶ 34-⁠38, 933 P.2d at 338</w:t>
       </w:r>
       <w:r>
         <w:noBreakHyphen/>
@@ -2842,13 +2812,13 @@
         <w:pStyle w:val="BodyText"/>
       </w:pPr>
       <w:r>
-        <w:t xml:space="preserve">Second, in addition to satisfying § 1089(D)⁠(8)⁠(b)⁠(1)—which he has not done—Petitioner must, but fails to, meet the requirements of § 1089(D)⁠(8)⁠(b)⁠(2). Under the latter provision, he must demonstrate that “the facts underlying the claim . . . would be sufficient to establish . . . [that] no reasonable fact finder would have found [him] guilty of the underlying offense or would have rendered the penalty of death.” 22 O.S.2011, § 1089. This Court has indicated that this standard requires a showing of actual, factual innocence, and that a showing of legal innocence is insufficient. See Braun v. State, 1997 OK CR 26, ¶ 28 n. 15, 937 P.2d 505, 514 n. 15. 19 Petitioner’s claim—that the State of Oklahoma lacked jurisdiction to try or sentence him to death—is at most a claim of legal innocence. See Jones v. Warden, 683 F. App’x 799, 801 (11th Cir. 2017) (unpublished) (state court prisoner’s attempt to claim actual innocence to avoid time bar failed because his claim that the state court lacked jurisdiction was “at most, a claim of legal innocence, not factual innocence”); Rashad v. Ives, No. 2:10-CV</w:t>
-      </w:r>
-      <w:r>
-        <w:noBreakHyphen/>
-      </w:r>
-      <w:r>
-        <w:t xml:space="preserve">0771 KJN P, 2010 WL 1644576, at *2 (E.D. Cal. Apr. 20, 2010) (unpublished) (petitioner’s claim that trial court lacked jurisdiction to try and sentence him was a claim of legal, not actual, innocence). Braun was discussing § 1089(C)⁠(2), which requires that a claim raised in any post-conviction application, even a first application, “[s]upport a conclusion either that the outcome of the trial would have been different but for the errors or that the defendant is factually innocent.” 22. O.S.2011, § 1089(C)⁠(2). However, despite the difference in wording between § 1089(C)⁠(2) and § 1089(D)⁠(8)⁠(b)⁠(2), it is clear that the latter provision still requires a showing of factual innocence of the crime or the death penalty. The language of § 1089(D)⁠(8)⁠(b)⁠(2), enacted in 2006, mirrors the Supreme Court’s well-established actual innocence standard. Compare 22 O.S.2011, § 1089(D)⁠(8)⁠(b)⁠(2) (“. . . no reasonable fact finder would have found the applicant guilty of the underlying offense or would have rendered the penalty of death”), with Schlup v. Delo, 513 U.S. 298, 327 (1995) (“To satisfy the [actual innocence] gateway standard, a petitioner must show that it is more likely than not that no reasonable juror would have found petitioner guilty beyond a reasonable doubt.”), and Sawyer v. Whitley, 505 U.S. 333, 336 (1992) (a prisoner can claim to be “actually innocent” of the death penalty if he can show “by clear and convincing evidence that, but for a constitutional error, no reasonable juror would have found the petitioner eligible for the death penalty under the applicable state law.”). And, as this Court recognized in Braun, the Supreme Court’s standard “is applicable only to factual innocence” and is “not applicable to legal innocence.” Braun, 1997 OK CR 26, ¶ 28 n. 15, 937 P.2d at 514 n. 15. Thus, in using language that mirrored the Supreme Court’s standard, it is clear the Oklahoma Legislature intended for § 1089(D)⁠(8)⁠(b)⁠(2) to require actual, not legal, innocence.</w:t>
+        <w:t xml:space="preserve">Second, in addition to satisfying § 1089(D)⁠(8)⁠(b)⁠(1)—⁠which he has not done—Petitioner must, but fails to, meet the requirements of § 1089(D)⁠(8)⁠(b)⁠(2). Under the latter provision, he must demonstrate that “the facts underlying the claim . . . would be sufficient to establish . . . [that] no reasonable fact finder would have found [him] guilty of the underlying offense or would have rendered the penalty of death.” 22 O.S.2011, § 1089. This Court has indicated that this standard requires a showing of actual, factual innocence, and that a showing of legal innocence is insufficient. See Braun v. State, 1997 OK CR 26, ¶ 28 n. 15, 937 P.2d 505, 514 n. 15. 19 Petitioner’s claim—that the State of Oklahoma lacked jurisdiction to try or sentence him to death—is at most a claim of legal innocence. See Jones v. Warden, 683 F. App’x 799, 801 (11th Cir. 2017) (unpublished) (state court prisoner’s attempt to claim actual innocence to avoid time bar failed because his claim that the state court lacked jurisdiction was “at most, a claim of legal innocence, not factual innocence”); Rashad v. Ives, No. 2:10-CV</w:t>
+      </w:r>
+      <w:r>
+        <w:noBreakHyphen/>
+      </w:r>
+      <w:r>
+        <w:t xml:space="preserve">0771 KJN P, 2010 WL 1644576, at *2 (E.D. Cal. Apr. 20, 2010) (unpublished) (petitioner’s claim that trial court lacked jurisdiction to try and sentence him was a claim of legal, not actual, innocence). Braun was discussing § 1089(C)⁠(2), which requires that a claim raised in any post-conviction application, even a first application, “[s]upport a conclusion either that the outcome of the trial would have been different but for the errors or that the defendant is factually innocent.” 22. O.S.2011, § 1089(C)⁠(2). However, despite the difference in wording between § 1089(C)⁠(2) and § 1089(D)⁠(8)⁠(b)⁠(2), it is clear that the latter provision still requires a showing of factual innocence of the crime or the death penalty. The language of § 1089(D)⁠(8)⁠(b)⁠(2), enacted in 2006, mirrors the Supreme Court’s well-established actual innocence standard. Compare 22 O.S.2011, § 1089(D)⁠(8)⁠(b)⁠(2) (“. . . no reasonable fact finder would have found the applicant guilty of the underlying offense or would have rendered the penalty of death”), with Schlup v. Delo, 513 U.S. 298, 327 (1995) (“To satisfy the [actual innocence] gateway standard, a petitioner must show that it is more likely than not that no reasonable juror would have found petitioner guilty beyond a reasonable doubt.”), and Sawyer v. Whitley, 505 U.S. 333, 336 (1992) (a prisoner can claim to be “actually innocent” of the death penalty if he can show “by clear and convincing evidence that, but for a constitutional error, no reasonable juror would have found the petitioner eligible for the death penalty under the applicable state law.”). And, as this Court recognized in Braun, the Supreme Court’s standard “is applicable only to factual innocence” and is “not applicable to legal innocence.” Braun, 1997 OK CR 26, ¶ 28 n. 15, 937 P.2d at 514 n. 15. Thus, in using language that mirrored the Supreme Court’s standard, it is clear the Oklahoma Legislature intended for § 1089(D)⁠(8)⁠(b)⁠(2) to require actual, not legal, innocence.</w:t>
       </w:r>
     </w:p>
     <w:p>
@@ -2894,37 +2864,19 @@
         <w:noBreakHyphen/>
       </w:r>
       <w:r>
-        <w:t xml:space="preserve">1200, Petitioner relies on a number of other cases that are inapposite, as they involved jurisdictional claims that were raised prior to second post-conviction and thus were not subject to § 1089(D)⁠(8). See Magnan v. State, 2009 OK CR 16, ¶ 9, 207 P.3d 397, 402 (direct appeal); Cravatt v. State, 1992 OK CR 6, ¶¶ 3</w:t>
-      </w:r>
-      <w:r>
-        <w:noBreakHyphen/>
-      </w:r>
-      <w:r>
-        <w:t xml:space="preserve">4, 825 P.2d 277, 278 (same); Buis v. State, 1990 OK CR 28, ¶ 1, 792 P.2d 427, 428 (same); see also Johnson v. State, 1980 OK CR 45, ¶ 30,, 611 P.2d 1137, 1145 (noting, only in dicta, that “[l]ack of jurisdiction, for instance, can be raised at any time”). Although Petitioner does not cite it, this Court also said in Wallace v. State, 1997 OK CR 18, ¶ 15, 935 P.2d 366, 372</w:t>
-      </w:r>
-      <w:r>
-        <w:noBreakHyphen/>
-      </w:r>
-      <w:r>
-        <w:t xml:space="preserve">73, that “issues of subject matter jurisdiction are never waived and can therefore be raised on a collateral appeal.” However, Wallace was a first post-conviction application. Wallace, 1997 OK CR 18, ¶¶ 1</w:t>
-      </w:r>
-      <w:r>
-        <w:noBreakHyphen/>
-      </w:r>
-      <w:r>
-        <w:t xml:space="preserve">2, 935 P.2d at 368</w:t>
-      </w:r>
-      <w:r>
-        <w:noBreakHyphen/>
-      </w:r>
-      <w:r>
-        <w:t xml:space="preserve">69. Finally, to the extent that any of this Court’s cases prior to the enactment of § 1089(D)⁠(8) stated that jurisdiction challenges may be raised at any time, such do not control here as they were decided prior to the passing of that statute and its restrictive provisions. To be clear, the State does not concede that belated jurisdictional claims should not be barred at early stages, such as on first post-conviction. See, e.g., 22 O.S.2011, § 1089(C) (providing limitations on the claims that may be considered in first capital post-conviction applications). However, because Petitioner’s claim here is on second post-conviction, the State limits its argument to the bars specific to that stage of litigation. In an appropriate case, the State will show that jurisdictional claims raised in first post-conviction applications should also be barred. Murphy filed a second capital post-conviction application claiming, as Petitioner does here, that the State lacked jurisdiction over his crime because it occurred in Indian Country. This Court fully reviewed Petitioner’s jurisdictional challenge on the merits but applied the restrictions of § 1089 to another claim raised by Petitioner, finding it to be waived. Murphy, 2005 OK CR 25, ¶¶ 6</w:t>
-      </w:r>
-      <w:r>
-        <w:noBreakHyphen/>
-      </w:r>
-      <w:r>
-        <w:t xml:space="preserve">54, 57</w:t>
+        <w:t xml:space="preserve">1200, Petitioner relies on a number of other cases that are inapposite, as they involved jurisdictional claims that were raised prior to second post-conviction and thus were not subject to § 1089(D)⁠(8). See Magnan v. State, 2009 OK CR 16, ¶ 9, 207 P.3d 397, 402 (direct appeal); Cravatt v. State, 1992 OK CR 6, ¶¶ 3-⁠4, 825 P.2d 277, 278 (same); Buis v. State, 1990 OK CR 28, ¶ 1, 792 P.2d 427, 428 (same); see also Johnson v. State, 1980 OK CR 45, ¶ 30,, 611 P.2d 1137, 1145 (noting, only in dicta, that “[l]ack of jurisdiction, for instance, can be raised at any time”). Although Petitioner does not cite it, this Court also said in Wallace v. State, 1997 OK CR 18, ¶ 15, 935 P.2d 366, 372</w:t>
+      </w:r>
+      <w:r>
+        <w:noBreakHyphen/>
+      </w:r>
+      <w:r>
+        <w:t xml:space="preserve">73, that “issues of subject matter jurisdiction are never waived and can therefore be raised on a collateral appeal.” However, Wallace was a first post-conviction application. Wallace, 1997 OK CR 18, ¶¶ 1-⁠2, 935 P.2d at 368</w:t>
+      </w:r>
+      <w:r>
+        <w:noBreakHyphen/>
+      </w:r>
+      <w:r>
+        <w:t xml:space="preserve">69. Finally, to the extent that any of this Court’s cases prior to the enactment of § 1089(D)⁠(8) stated that jurisdiction challenges may be raised at any time, such do not control here as they were decided prior to the passing of that statute and its restrictive provisions. To be clear, the State does not concede that belated jurisdictional claims should not be barred at early stages, such as on first post-conviction. See, e.g., 22 O.S.2011, § 1089(C) (providing limitations on the claims that may be considered in first capital post-conviction applications). However, because Petitioner’s claim here is on second post-conviction, the State limits its argument to the bars specific to that stage of litigation. In an appropriate case, the State will show that jurisdictional claims raised in first post-conviction applications should also be barred. Murphy filed a second capital post-conviction application claiming, as Petitioner does here, that the State lacked jurisdiction over his crime because it occurred in Indian Country. This Court fully reviewed Petitioner’s jurisdictional challenge on the merits but applied the restrictions of § 1089 to another claim raised by Petitioner, finding it to be waived. Murphy, 2005 OK CR 25, ¶¶ 6-⁠54, 57</w:t>
       </w:r>
       <w:r>
         <w:noBreakHyphen/>
@@ -2950,13 +2902,7 @@
         <w:noBreakHyphen/>
       </w:r>
       <w:r>
-        <w:t xml:space="preserve">97, Wackerly filed a second capital post-conviction application, arguing that the State lacked jurisdiction to prosecute him for the murder of which he was convicted because the crime occurred on land owned by the federal government. This Court noted that, “[o]rdinarily, this claim would be barred because the factual and legal bases upon which it is based were available and could have been presented in a timely original application.” Wackerly, 2010 OK CR 16, ¶ 4, 237 P.3d at 797 (citing 22 O.S.Supp.2006, § 1089(D)⁠(8)). This Court reasoned, however, “that ‘issues of subject matter jurisdiction are never waived and can therefore be raised on collateral appeal.’” Id., 2010 OK CR 16, ¶ 4, 237 P.3d at 797 (quoting Wallace, 1997 OK CR 18, ¶ 15, 935 P.2d at 372). Accordingly, this Court considered, but ultimately rejected, Wackerly’s jurisdictional claim. Id., 2010 OK CR 16, ¶¶ 4</w:t>
-      </w:r>
-      <w:r>
-        <w:noBreakHyphen/>
-      </w:r>
-      <w:r>
-        <w:t xml:space="preserve">10, 237 P.3d at 797</w:t>
+        <w:t xml:space="preserve">97, Wackerly filed a second capital post-conviction application, arguing that the State lacked jurisdiction to prosecute him for the murder of which he was convicted because the crime occurred on land owned by the federal government. This Court noted that, “[o]rdinarily, this claim would be barred because the factual and legal bases upon which it is based were available and could have been presented in a timely original application.” Wackerly, 2010 OK CR 16, ¶ 4, 237 P.3d at 797 (citing 22 O.S.Supp.2006, § 1089(D)⁠(8)). This Court reasoned, however, “that ‘issues of subject matter jurisdiction are never waived and can therefore be raised on collateral appeal.’” Id., 2010 OK CR 16, ¶ 4, 237 P.3d at 797 (quoting Wallace, 1997 OK CR 18, ¶ 15, 935 P.2d at 372). Accordingly, this Court considered, but ultimately rejected, Wackerly’s jurisdictional claim. Id., 2010 OK CR 16, ¶¶ 4-⁠10, 237 P.3d at 797</w:t>
       </w:r>
       <w:r>
         <w:noBreakHyphen/>
@@ -3114,7 +3060,7 @@
         <w:pStyle w:val="BodyText"/>
       </w:pPr>
       <w:r>
-        <w:t xml:space="preserve">found the applicant guilty of the underlying offense. . . .” AEDPA, PL 104–132, April 24, 1996, 110 Stat 1214. To this day, § 2244 contains these same limitations on the filing of successive habeas petitions. 28 U.S.C. § 2244(b)⁠(2).</w:t>
+        <w:t xml:space="preserve">found the applicant guilty of the underlying offense. . . .” AEDPA, PL 104–132, April 24, 1996, 110 Stat 1214. To this day, § 2244 contains these same limitations on the filing of successive habeas petitions. 28 U.S.C. § 2244(b)⁠(2).</w:t>
       </w:r>
     </w:p>
     <w:p>
@@ -3438,7 +3384,7 @@
         <w:pStyle w:val="BodyText"/>
       </w:pPr>
       <w:r>
-        <w:t xml:space="preserve">Thus, as finally amended, § 1089 provides essentially the same restrictions on capital post- conviction applications that apply to successive habeas petitions under the AEDPA. Both § 1089 and the AEDPA limit successive filings to two categories—those with certain previously unavailable legal grounds and those with certain previously unavailable factual grounds. Previously unavailable legal grounds exist only when the Supreme Court (or this Court, in the case of § 1089) announces a new rule of constitutional law with retroactive effect. Compare 22 O.S.2011, § 1089(D)⁠(8)⁠(a), (9)⁠(b), with 28 U.S.C. § 2244(b)⁠(2)⁠(A).21 Previously unavailable factual grounds exist only when the factual grounds could not have been earlier discovered through the exercise of reasonable diligence and the facts show actual innocence of the crime of conviction (or of the death penalty, in the case of § 1089). Compare 22 O.S.2011, § 1089(D)⁠(8)⁠(b)⁠(1)-(2), with 28 U.S.C. § 2244(b)⁠(2)⁠(B)⁠(i)-(ii). Based on the plain language of both statutes, neither statute provides an exception to its restrictions for challenges to the trial court’s subject matter jurisdiction.</w:t>
+        <w:t xml:space="preserve">Thus, as finally amended, § 1089 provides essentially the same restrictions on capital post- conviction applications that apply to successive habeas petitions under the AEDPA. Both § 1089 and the AEDPA limit successive filings to two categories—those with certain previously unavailable legal grounds and those with certain previously unavailable factual grounds. Previously unavailable legal grounds exist only when the Supreme Court (or this Court, in the case of § 1089) announces a new rule of constitutional law with retroactive effect. Compare 22 O.S.2011, § 1089(D)⁠(8)⁠(a), (9)⁠(b), with 28 U.S.C. § 2244(b)⁠(2)⁠(A).21 Previously unavailable factual grounds exist only when the factual grounds could not have been earlier discovered through the exercise of reasonable diligence and the facts show actual innocence of the crime of conviction (or of the death penalty, in the case of § 1089). Compare 22 O.S.2011, § 1089(D)⁠(8)⁠(b)⁠(1)-⁠(2), with 28 U.S.C. § 2244(b)⁠(2)⁠(B)⁠(i)-⁠(ii). Based on the plain language of both statutes, neither statute provides an exception to its restrictions for challenges to the trial court’s subject matter jurisdiction.</w:t>
       </w:r>
     </w:p>
     <w:p>
@@ -3866,7 +3812,7 @@
         <w:pStyle w:val="BodyText"/>
       </w:pPr>
       <w:r>
-        <w:t xml:space="preserve">In Dopp, as already mentioned, the Tenth Circuit applied Prost and In re Cline to a state habeas petitioner’s attempt to file a successive habeas petition based on the Tenth Circuit’s decision in Murphy. The petitioner claimed the “Ottawa County District Court lacked jurisdiction to enter judgment and sentence against him because he committed his crimes of conviction within ‘Indian Country,’ specifically within the boundaries of the Seneca-Cayuga Tribe reservation.” Dopp, 750 F. App’x at 756 (quoting Dopp’s habeas petition). The petitioner further contended that “his claim challenging the state trial court’s jurisdiction is not second or successive because . . . a jurisdictional claim can be brought at any time and cannot be waived or forfeited.” Id. The Tenth Circuit disagreed and concluded that the federal district court properly dismissed the habeas petition as an unauthorized second or successive petition: “Contrary to his assertion, Dopp’s jurisdictional challenge is not exempt from authorization under § 2244(b). . . . [T]he jurisdictional nature of Dopp’s claim does not exempt his § 2254 application from dismissal for lack of jurisdiction as a successive and unauthorized application.” Id. at 756</w:t>
+        <w:t xml:space="preserve">In Dopp, as already mentioned, the Tenth Circuit applied Prost and In re Cline to a state habeas petitioner’s attempt to file a successive habeas petition based on the Tenth Circuit’s decision in Murphy. The petitioner claimed the “Ottawa County District Court lacked jurisdiction to enter judgment and sentence against him because he committed his crimes of conviction within ‘Indian Country,’ specifically within the boundaries of the Seneca-Cayuga Tribe reservation.” Dopp, 750 F. App’x at 756 (quoting Dopp’s habeas petition). The petitioner further contended that “his claim challenging the state trial court’s jurisdiction is not second or successive because . . . a jurisdictional claim can be brought at any time and cannot be waived or forfeited.” Id. The Tenth Circuit disagreed and concluded that the federal district court properly dismissed the habeas petition as an unauthorized second or successive petition: “Contrary to his assertion, Dopp’s jurisdictional challenge is not exempt from authorization under § 2244(b). . . . [T]he jurisdictional nature of Dopp’s claim does not exempt his § 2254 application from dismissal for lack of jurisdiction as a successive and unauthorized application.” Id. at 756</w:t>
       </w:r>
       <w:r>
         <w:noBreakHyphen/>
@@ -4014,7 +3960,7 @@
         <w:pStyle w:val="BodyText"/>
       </w:pPr>
       <w:r>
-        <w:t xml:space="preserve">raising all potentially meritorious claims. Walker, 1997 OK CR 3, ¶ 5, 933 P.2d at 331. Giving § 1089 its proper narrow construction, it is clear that the statute does not allow jurisdictional claims to escape its restrictions. A contrary interpretation contravenes legislative intent. Cf. Prost, 636 F.3d at 589 (“The simple fact is that Congress decided that, unless subsection (h)’s requirements are met, finality concerns trump and the litigation must stop after a first collateral attack. Neither is this court free to reopen and replace Congress’s judgment with our own.”). In fact, the Oklahoma Legislature did provide an exception to the bar on successive capital post- conviction applications that has no parallel in § 2244: where the legal basis for a claim “was not recognized by or could not have been reasonably formulated from a final decision of the United States Supreme Court, a court of appeals of the United States, or a court of appellate jurisdiction of this state . . . .” 22 O.S.2011, § 1089(D)⁠(9)⁠(a). Thus, with that provision, the Legislature made clear its desire to carve out an exception beyond those provided in the AEDPA. Its failure to do so as to jurisdictional claims speaks volumes.</w:t>
+        <w:t xml:space="preserve">raising all potentially meritorious claims. Walker, 1997 OK CR 3, ¶ 5, 933 P.2d at 331. Giving § 1089 its proper narrow construction, it is clear that the statute does not allow jurisdictional claims to escape its restrictions. A contrary interpretation contravenes legislative intent. Cf. Prost, 636 F.3d at 589 (“The simple fact is that Congress decided that, unless subsection (h)’s requirements are met, finality concerns trump and the litigation must stop after a first collateral attack. Neither is this court free to reopen and replace Congress’s judgment with our own.”). In fact, the Oklahoma Legislature did provide an exception to the bar on successive capital post- conviction applications that has no parallel in § 2244: where the legal basis for a claim “was not recognized by or could not have been reasonably formulated from a final decision of the United States Supreme Court, a court of appeals of the United States, or a court of appellate jurisdiction of this state . . . .” 22 O.S.2011, § 1089(D)⁠(9)⁠(a). Thus, with that provision, the Legislature made clear its desire to carve out an exception beyond those provided in the AEDPA. Its failure to do so as to jurisdictional claims speaks volumes.</w:t>
       </w:r>
     </w:p>
     <w:p>
@@ -4188,19 +4134,19 @@
         <w:noBreakHyphen/>
       </w:r>
       <w:r>
-        <w:t xml:space="preserve">3 (Thomas, J., dissenting). Moreover, in the Murphy litigation before the Supreme Court, Murphy’s Brief in Opposition to the State’s Petition for Writ of Certiorari scoffed at the idea that numerous state court convictions would be open to attack if the Tenth Circuit’s decision were permitted to stand. Among other things, Murphy asserted that “[s]tate courts . . . limit defendants from challenging long-final convictions. See, e.g., Okla. Stat. tit. 22 § 1086 (requiring “sufficient reason” to consider successive petition) . . . .” Brief in Opposition at 33, Terry Royal v. Patrick Dwayne Murphy, Case No. 17</w:t>
-      </w:r>
-      <w:r>
-        <w:noBreakHyphen/>
-      </w:r>
-      <w:r>
-        <w:t xml:space="preserve">1107 (U.S. Supreme Court, April 29, 2018) (hereinafter, “Murphy Brief in Opposition”) (available at https://www.supremecourt.gov/​DocketPDF/​17/17</w:t>
-      </w:r>
-      <w:r>
-        <w:noBreakHyphen/>
-      </w:r>
-      <w:r>
-        <w:t xml:space="preserve">1107/42807/20180409154638946_Murphy% 20BIO%204</w:t>
+        <w:t xml:space="preserve">3 (Thomas, J., dissenting). Moreover, in the Murphy litigation before the Supreme Court, Murphy’s Brief in Opposition to the State’s Petition for Writ of Certiorari scoffed at the idea that numerous state court convictions would be open to attack if the Tenth Circuit’s decision were permitted to stand. Among other things, Murphy asserted that “[s]tate courts . . . limit defendants from challenging long-final convictions. See, e.g., Okla. Stat. tit. 22 § 1086 (requiring “sufficient reason” to consider successive petition) . . . .” Brief in Opposition at 33, Terry Royal v. Patrick Dwayne Murphy, Case No. 17</w:t>
+      </w:r>
+      <w:r>
+        <w:noBreakHyphen/>
+      </w:r>
+      <w:r>
+        <w:t xml:space="preserve">1107 (U.S. Supreme Court, April 29, 2018) (hereinafter, “Murphy Brief in Opposition”) (available at https://​www.​supremecourt.​gov/​DocketPDF/​​17/​17</w:t>
+      </w:r>
+      <w:r>
+        <w:noBreakHyphen/>
+      </w:r>
+      <w:r>
+        <w:t xml:space="preserve">1107/​42807/​20180409154638946_Murphy% 20BIO%204</w:t>
       </w:r>
       <w:r>
         <w:noBreakHyphen/>
@@ -4298,7 +4244,7 @@
         <w:noBreakHyphen/>
       </w:r>
       <w:r>
-        <w:t xml:space="preserve">1107 (U.S. Supreme Court, Nov. 27, 2018) (“Murphy Argument Transcript”) (available at https://www.supremecourt.gov/​oral_arguments/​argument_ transcripts/2018/17</w:t>
+        <w:t xml:space="preserve">1107 (U.S. Supreme Court, Nov. 27, 2018) (“Murphy Argument Transcript”) (available at https://​www.​supremecourt.​gov/​oral_arguments/​argument_ transcripts/2018/17</w:t>
       </w:r>
       <w:r>
         <w:noBreakHyphen/>
@@ -4318,15 +4264,15 @@
         <w:noBreakHyphen/>
       </w:r>
       <w:r>
-        <w:t xml:space="preserve">98 (“The right to relief . . . may be lost by laches, when the petition for habeas corpus is delayed for a period of time so long that the minds of the trial judge and court attendants become clouded by time and uncertainty as to what happened, or due to dislocation of witnesses, the grim hand of death and the loss of records the rights sought to be asserted have become mere matters of speculation, based upon faulty recollections, or figments of imagination, if not outright falsifications.”). Furthermore, the laches doctrine applies to collateral attacks upon convictions, including by means of an application for post-conviction relief. Thomas, 1995 OK CR 47, ¶ 15, 903 P.2d at 332; see also Paxton v. State, 1995 OK CR 46, ¶ 8 903 P.2d 325, 327 (“We hold, therefore, that the doctrine of laches has been and continues to be applicable, in appropriate cases, to collateral attacks upon convictions, whether by means of an extraordinary writ, as in former Petitioner cannot seriously claim he sat on his claim in reliance on Wackerly, as he does not even cite Wackerly, or any other case, in support of any argument that he is not subject to the sixty-day rule. times, or by means of an application for post-conviction relief.”). “Thus, the doctrine of laches may prohibit the consideration of an application for post-conviction relief where a petitioner has forfeited that right through his own inaction.” Paxton, 1995 OK CR 46, ¶ 8, 903 P.2d at 327.</w:t>
-      </w:r>
-    </w:p>
-    <w:p>
-      <w:pPr>
-        <w:pStyle w:val="BodyText"/>
-      </w:pPr>
-      <w:r>
-        <w:t xml:space="preserve">This Court has “emphasize[d] that the applicability of the doctrine of laches necessarily turns on the facts of each particular case.” Id. The question is whether the post-conviction applicant has provided “sufficient reason” for the delay in seeking post-conviction relief. See id., 1995 OK CR 47, ¶ 16, 903 P.2d at 332 (holding that “Petitioner’s contention that depression caused by incarceration for subsequent convictions have prevented him from seeking relief . . . for fifteen years is not sufficient reason to overcome the doctrine of laches”). Finally, this Court has refused to place a threshold burden upon the State to demonstrate actual prejudice before laches applies. Id., 1995 OK CR 47, ¶ 14, 903 P.2d 328, 332.</w:t>
+        <w:t xml:space="preserve">98 (“The right to relief . . . may be lost by laches, when the petition for habeas corpus is delayed for a period of time so long that the minds of the trial judge and court attendants become clouded by time and uncertainty as to what happened, or due to dislocation of witnesses, the grim hand of death and the loss of records the rights sought to be asserted have become mere matters of speculation, based upon faulty recollections, or figments of imagination, if not outright falsifications.”). Furthermore, the laches doctrine applies to collateral attacks upon convictions, including by means of an application for post-conviction relief. Thomas, 1995 OK CR 47, ¶ 15, 903 P.2d at 332; see also Paxton v. State, 1995 OK CR 46, ¶ 8 903 P.2d 325, 327 (“We hold, therefore, that the doctrine of laches has been and continues to be applicable, in appropriate cases, to collateral attacks upon convictions, whether by means of an extraordinary writ, as in former Petitioner cannot seriously claim he sat on his claim in reliance on Wackerly, as he does not even cite Wackerly, or any other case, in support of any argument that he is not subject to the sixty-day rule. times, or by means of an application for post-conviction relief.”). “Thus, the doctrine of laches may prohibit the consideration of an application for post-conviction relief where a petitioner has forfeited that right through his own inaction.” Paxton, 1995 OK CR 46, ¶ 8, 903 P.2d at 327.</w:t>
+      </w:r>
+    </w:p>
+    <w:p>
+      <w:pPr>
+        <w:pStyle w:val="BodyText"/>
+      </w:pPr>
+      <w:r>
+        <w:t xml:space="preserve">This Court has “emphasize[d] that the applicability of the doctrine of laches necessarily turns on the facts of each particular case.” Id. The question is whether the post-conviction applicant has provided “sufficient reason” for the delay in seeking post-conviction relief. See id., 1995 OK CR 47, ¶ 16, 903 P.2d at 332 (holding that “Petitioner’s contention that depression caused by incarceration for subsequent convictions have prevented him from seeking relief . . . for fifteen years is not sufficient reason to overcome the doctrine of laches”). Finally, this Court has refused to place a threshold burden upon the State to demonstrate actual prejudice before laches applies. Id., 1995 OK CR 47, ¶ 14, 903 P.2d 328, 332.</w:t>
       </w:r>
     </w:p>
     <w:p>
@@ -4382,7 +4328,7 @@
         <w:pStyle w:val="BodyText"/>
       </w:pPr>
       <w:r>
-        <w:t xml:space="preserve">to be true . . . today, while leaving questions about . . . reliance interest[s] for later</w:t>
+        <w:t xml:space="preserve">to be true . . . today, while leaving questions about . . . reliance interest[s] for later</w:t>
       </w:r>
     </w:p>
     <w:p>
@@ -4444,7 +4390,7 @@
         <w:pStyle w:val="BodyText"/>
       </w:pPr>
       <w:r>
-        <w:t xml:space="preserve">exemption of the parcels from local taxation. . . .</w:t>
+        <w:t xml:space="preserve">exemption of the parcels from local taxation. . . .</w:t>
       </w:r>
     </w:p>
     <w:p>
@@ -4512,13 +4458,7 @@
         <w:pStyle w:val="BodyText"/>
       </w:pPr>
       <w:r>
-        <w:t xml:space="preserve">Similarly, in Allen v. Raines, 1961 OK CR 41, ¶¶ 6</w:t>
-      </w:r>
-      <w:r>
-        <w:noBreakHyphen/>
-      </w:r>
-      <w:r>
-        <w:t xml:space="preserve">8, 360 P.2d 949, 951, this Court applied laches to a state habeas petitioner’s claim that he was not furnished counsel at the time of his guilty plea sixteen years prior. Importantly, at the time, this Court treated the denial of counsel as a jurisdictional issue. See Allen, 1961 OK CR 41, ¶ 6, 360 P.2d at 951 (“We have held that a trial court may lose jurisdiction to pronounce judgment by failure to complete the court by appointing counsel to represent the accused where the accused has not effectively waived his constitutional right to the assistance of counsel.”); see also Application of Smith, 1959 OK CR 59, ¶ ¶ 1, 10</w:t>
+        <w:t xml:space="preserve">Similarly, in Allen v. Raines, 1961 OK CR 41, ¶¶ 6-⁠8, 360 P.2d 949, 951, this Court applied laches to a state habeas petitioner’s claim that he was not furnished counsel at the time of his guilty plea sixteen years prior. Importantly, at the time, this Court treated the denial of counsel as a jurisdictional issue. See Allen, 1961 OK CR 41, ¶ 6, 360 P.2d at 951 (“We have held that a trial court may lose jurisdiction to pronounce judgment by failure to complete the court by appointing counsel to represent the accused where the accused has not effectively waived his constitutional right to the assistance of counsel.”); see also Application of Smith, 1959 OK CR 59, ¶ ¶ 1, 10</w:t>
       </w:r>
       <w:r>
         <w:noBreakHyphen/>
@@ -4592,7 +4532,7 @@
         <w:pStyle w:val="BodyText"/>
       </w:pPr>
       <w:r>
-        <w:t xml:space="preserve">convictions [that] will be subject to collateral attack.” Pet. 21. . . . State courts . . .</w:t>
+        <w:t xml:space="preserve">convictions [that] will be subject to collateral attack.” Pet. 21. . . . State courts . . .</w:t>
       </w:r>
     </w:p>
     <w:p>
@@ -4630,13 +4570,13 @@
         <w:noBreakHyphen/>
       </w:r>
       <w:r>
-        <w:t xml:space="preserve">1107 (U.S. Supreme Court Dec. 28, 2018) (available at https://www.supremecourt.gov/​DocketPDF/​17/17</w:t>
-      </w:r>
-      <w:r>
-        <w:noBreakHyphen/>
-      </w:r>
-      <w:r>
-        <w:t xml:space="preserve">1107/77854/20181228130713523_17</w:t>
+        <w:t xml:space="preserve">1107 (U.S. Supreme Court Dec. 28, 2018) (available at https://​www.​supremecourt.​gov/​DocketPDF/​​17/​17</w:t>
+      </w:r>
+      <w:r>
+        <w:noBreakHyphen/>
+      </w:r>
+      <w:r>
+        <w:t xml:space="preserve">1107/​77854/​20181228130713523_17</w:t>
       </w:r>
       <w:r>
         <w:noBreakHyphen/>
@@ -4664,7 +4604,7 @@
         <w:pStyle w:val="BodyText"/>
       </w:pPr>
       <w:r>
-        <w:t xml:space="preserve">It bears repeating that Petitioner knowingly sat on his jurisdictional claim for months before filing it in this Court, all while his counsel downplayed the effects of the Tenth Circuit’s decision in the Murphy litigation before the Supreme Court. In McGirt, the majority ridiculed the “speculative” concern of “Oklahoma and the dissent” that “thousands of Native Americans like Mr. McGirt wait in the wings to challenge the jurisdictional basis of their state-court convictions.” McGirt, slip op. at 38 (quotation marks omitted). And yet, that is exactly what happened in this case. At bottom, laches is an equitable doctrine. See Sullivan v. Buckhorn Ranch P’ship, 2005 OK 41, ¶ 32, 119 P.3d 192, 202 (“Laches is an equitable defense to stale claims. . . . Application of the doctrine is discretionary depending on the facts and circumstances of each case as justice requires.”). Under these circumstances, it is grossly inequitable and unjust to reward Petitioner with consideration of his belated jurisdictional claim.</w:t>
+        <w:t xml:space="preserve">It bears repeating that Petitioner knowingly sat on his jurisdictional claim for months before filing it in this Court, all while his counsel downplayed the effects of the Tenth Circuit’s decision in the Murphy litigation before the Supreme Court. In McGirt, the majority ridiculed the “speculative” concern of “Oklahoma and the dissent” that “thousands of Native Americans like Mr. McGirt wait in the wings to challenge the jurisdictional basis of their state-court convictions.” McGirt, slip op. at 38 (quotation marks omitted). And yet, that is exactly what happened in this case. At bottom, laches is an equitable doctrine. See Sullivan v. Buckhorn Ranch P’ship, 2005 OK 41, ¶ 32, 119 P.3d 192, 202 (“Laches is an equitable defense to stale claims. . . . Application of the doctrine is discretionary depending on the facts and circumstances of each case as justice requires.”). Under these circumstances, it is grossly inequitable and unjust to reward Petitioner with consideration of his belated jurisdictional claim.</w:t>
       </w:r>
     </w:p>
     <w:p>
@@ -5687,6 +5627,7 @@
     <w:unhideWhenUsed/>
     <w:qFormat/>
     <w:pPr>
+      <w:keepLines/>
       <w:spacing w:before="0" w:after="140" w:line="299" w:lineRule="exact"/>
     </w:pPr>
     <w:rPr>
@@ -5937,6 +5878,33 @@
     <w:pPr>
       <w:spacing w:before="0" w:after="0" w:line="299" w:lineRule="exact"/>
       <w:ind w:left="2160" w:hanging="720"/>
+    </w:pPr>
+  </w:style>
+  <w:style w:type="paragraph" w:customStyle="1" w:styleId="XdQuoteList1">
+    <w:name w:val="Xd Quote List 1"/>
+    <w:basedOn w:val="Normal"/>
+    <w:qFormat/>
+    <w:pPr>
+      <w:spacing w:before="0" w:after="0" w:line="299" w:lineRule="exact"/>
+      <w:ind w:left="1440" w:right="720" w:hanging="720"/>
+    </w:pPr>
+  </w:style>
+  <w:style w:type="paragraph" w:customStyle="1" w:styleId="XdQuoteList2">
+    <w:name w:val="Xd Quote List 2"/>
+    <w:basedOn w:val="Normal"/>
+    <w:qFormat/>
+    <w:pPr>
+      <w:spacing w:before="0" w:after="0" w:line="299" w:lineRule="exact"/>
+      <w:ind w:left="2160" w:right="720" w:hanging="720"/>
+    </w:pPr>
+  </w:style>
+  <w:style w:type="paragraph" w:customStyle="1" w:styleId="XdQuoteList3">
+    <w:name w:val="Xd Quote List 3"/>
+    <w:basedOn w:val="Normal"/>
+    <w:qFormat/>
+    <w:pPr>
+      <w:spacing w:before="0" w:after="0" w:line="299" w:lineRule="exact"/>
+      <w:ind w:left="2880" w:right="720" w:hanging="720"/>
     </w:pPr>
   </w:style>
   <w:style w:type="paragraph" w:customStyle="1" w:styleId="XdList1">

</xml_diff>